<commit_message>
Document lightweight installation and package submission
</commit_message>
<xml_diff>
--- a/docs/report/DentalExplain Report.docx
+++ b/docs/report/DentalExplain Report.docx
@@ -83,7 +83,7 @@
         <w:rPr>
           <w:rFonts w:ascii="Times New Roman" w:cs="Times New Roman" w:eastAsia="Times New Roman" w:hAnsi="Times New Roman"/>
         </w:rPr>
-        <w:t xml:space="preserve">Application 1.2.0   Knowledge 0.4.0</w:t>
+        <w:t xml:space="preserve">Application 1.3.0   Knowledge 0.4.0</w:t>
       </w:r>
     </w:p>
     <w:p>
@@ -127,7 +127,7 @@
         <w:rPr>
           <w:rFonts w:ascii="Times New Roman" w:cs="Times New Roman" w:eastAsia="Times New Roman" w:hAnsi="Times New Roman"/>
         </w:rPr>
-        <w:t xml:space="preserve">Twenty synthetic acceptance cases and 51 Prolog checks pass. Java integration and interface checks, together with bundled-runtime verification, pass on Apple Silicon macOS, Windows x64 and Ubuntu 24.04 x64. Manual desktop verification was performed on macOS; Windows and Linux verification was automated. The submission includes runnable platform packages and interface and Prolog source. Kushala Jayawickrama, a final-year fifth-year Dental Surgery undergraduate at the University of Peradeniya, is the project's human expert. The questionnaire was conducted with her, and her input together with published dental sources informed the facts and rules. Clinical validation remains pending.</w:t>
+        <w:t xml:space="preserve">Twenty synthetic acceptance cases and 51 Prolog checks pass. Java integration and interface checks, together with external-runtime verification, pass on Apple Silicon macOS, Windows x64 and Ubuntu 24.04 x64. Manual desktop verification was performed on macOS; Windows and Linux verification was automated. The lightweight submission includes installation scripts, runtime-free application files, and interface and Prolog source. Kushala Jayawickrama, a final-year fifth-year Dental Surgery undergraduate at the University of Peradeniya, is the project's human expert. The questionnaire was conducted with her, and her input together with published dental sources informed the facts and rules. Clinical validation remains pending.</w:t>
       </w:r>
     </w:p>
     <w:p>
@@ -2326,7 +2326,7 @@
         <w:rPr>
           <w:rFonts w:ascii="Times New Roman" w:cs="Times New Roman" w:eastAsia="Times New Roman" w:hAnsi="Times New Roman"/>
         </w:rPr>
-        <w:t xml:space="preserve">Java 21 and Swing provide the native desktop interface. SWI-Prolog 10.0.2 performs reasoning through matching JPL Java/JNI libraries. Java Swing was selected for standard controls and a shared interface codebase. JPL still requires platform-specific native dependencies [7]. Windows and macOS application images use Java packaging tools [8]. The expert-system implementation uses Java, Prolog and shell scripts, with no Python inference or interface implementation.</w:t>
+        <w:t xml:space="preserve">Java 21 and Swing provide the native desktop interface. SWI-Prolog 10.0.2 performs reasoning through matching JPL Java/JNI libraries. Java Swing was selected for standard controls and a shared interface codebase. JPL still requires platform-specific native dependencies [7]. Runtime-free launchers use explicitly installed Java and matching Prolog/JPL dependencies [7,8]. The expert-system implementation uses Java, Prolog and shell scripts, with no Python inference or interface implementation.</w:t>
       </w:r>
     </w:p>
     <w:p>
@@ -2467,18 +2467,29 @@
         <w:rPr>
           <w:rFonts w:ascii="Times New Roman" w:cs="Times New Roman" w:eastAsia="Times New Roman" w:hAnsi="Times New Roman"/>
         </w:rPr>
-        <w:t xml:space="preserve">Application version 1.2.0 uses knowledge version 0.4.0. The submission contains a Windows x64 executable image, an Apple Silicon macOS app and a bundled Java package for Ubuntu 24.04 x64 desktops. Each retains Java, SWI-Prolog/JPL, knowledge files and legal notices. Users must keep complete application folders together.</w:t>
-      </w:r>
-    </w:p>
-    <w:p>
-      <w:pPr>
-        <w:spacing w:after="120" w:line="270"/>
-      </w:pPr>
-      <w:r>
-        <w:rPr>
-          <w:rFonts w:ascii="Times New Roman" w:cs="Times New Roman" w:eastAsia="Times New Roman" w:hAnsi="Times New Roman"/>
-        </w:rPr>
-        <w:t xml:space="preserve">The root launchers open those packages without compilation or separate Java/Prolog installation. The Java application JAR is shared code, but cannot run alone without its accompanying dependencies. Windows signing and macOS notarization remain pending; native platform packages are distinct from an installer.</w:t>
+        <w:t xml:space="preserve">Application version 1.3.0 uses knowledge version 0.4.0. The submission contains one shared application JAR, a small Windows x64 startup executable and an Apple Silicon macOS app wrapper. Java and SWI-Prolog runtimes are installed separately rather than included in the ZIP. Two root scripts per operating system perform dependency installation and current-user application installation. Appendix A gives the launch instructions.</w:t>
+      </w:r>
+    </w:p>
+    <w:p>
+      <w:pPr>
+        <w:spacing w:after="120" w:line="270"/>
+      </w:pPr>
+      <w:r>
+        <w:rPr>
+          <w:rFonts w:ascii="Times New Roman" w:cs="Times New Roman" w:eastAsia="Times New Roman" w:hAnsi="Times New Roman"/>
+        </w:rPr>
+        <w:t xml:space="preserve">Dependency scripts verify official download checksums, retain unrelated installations and use matching JPL libraries from SWI-Prolog 10.0.2. Java 21 is installed machine-wide using Temurin vendor installers on Windows/macOS and OpenJDK through APT on Ubuntu. Prolog uses a versioned location: Program Files on Windows, /Applications/SWI-Prolog-10.0.2.app on macOS and /opt/dentalexplain-dependencies/swipl-10.0.2 on Linux. Ubuntu builds the verified 10.0.2 source with JPL; initial compilation takes longer [7,8].</w:t>
+      </w:r>
+    </w:p>
+    <w:p>
+      <w:pPr>
+        <w:spacing w:after="120" w:line="270"/>
+      </w:pPr>
+      <w:r>
+        <w:rPr>
+          <w:rFonts w:ascii="Times New Roman" w:cs="Times New Roman" w:eastAsia="Times New Roman" w:hAnsi="Times New Roman"/>
+        </w:rPr>
+        <w:t xml:space="preserve">DentalExplain itself is installed for the current user. Windows provides desktop and Start-menu shortcuts to DentalExplain.exe; macOS installs DentalExplain.app in the user’s Applications folder; Linux provides an application-menu shortcut. Startup resolves knowledge and dependency paths explicitly and reports missing dependencies. Initial setup needs internet access and administrator permission; ordinary consultations work offline afterward. Windows signing and macOS notarization remain pending. Archived distributions can still use bundled runtimes.</w:t>
       </w:r>
     </w:p>
     <w:p>
@@ -3654,7 +3665,7 @@
                 <w:sz w:val="20"/>
                 <w:szCs w:val="20"/>
               </w:rPr>
-              <w:t xml:space="preserve">Bundled Java launch from a path with spaces</w:t>
+              <w:t xml:space="preserve">External-runtime launch from a path with spaces</w:t>
             </w:r>
           </w:p>
         </w:tc>
@@ -3776,7 +3787,7 @@
                 <w:sz w:val="20"/>
                 <w:szCs w:val="20"/>
               </w:rPr>
-              <w:t xml:space="preserve">Native launcher initialization</w:t>
+              <w:t xml:space="preserve">Installed application startup</w:t>
             </w:r>
           </w:p>
         </w:tc>
@@ -3863,7 +3874,7 @@
                 <w:sz w:val="20"/>
                 <w:szCs w:val="20"/>
               </w:rPr>
-              <w:t xml:space="preserve">Java launcher used</w:t>
+              <w:t xml:space="preserve">PASS launcher and menu entry</w:t>
             </w:r>
           </w:p>
         </w:tc>
@@ -3882,7 +3893,7 @@
         <w:rPr>
           <w:rFonts w:ascii="Times New Roman" w:cs="Times New Roman" w:eastAsia="Times New Roman" w:hAnsi="Times New Roman"/>
         </w:rPr>
-        <w:t xml:space="preserve">These results are recorded in the successful cross-platform workflow on 29 September 2026 [10]. The current source retains the tested engine and application behavior. The report-data export separately reassesses all 20 fixtures. Full case records remain in the separate acceptance-test document.</w:t>
+        <w:t xml:space="preserve">These results are recorded in the successful cross-platform workflow on 29 September 2026 [10]. The workflow uses machine-wide external dependencies and runtime-free current-user installations. Repeated installation and missing-dependency/checksum failures were checked. The report-data export separately reassesses all 20 fixtures. Full case records remain in the separate acceptance-test document.</w:t>
       </w:r>
     </w:p>
     <w:p>
@@ -4702,7 +4713,7 @@
         <w:rPr>
           <w:rFonts w:ascii="Times New Roman" w:cs="Times New Roman" w:eastAsia="Times New Roman" w:hAnsi="Times New Roman"/>
         </w:rPr>
-        <w:t xml:space="preserve">The submission assembly verifies source inclusion, report files, three root launch scripts, complete runtime directories, executable permissions and SHA-256 checksums. Launch checks use extracted folders containing spaces. Recorded software results do not establish diagnostic accuracy in real patients; clinical knowledge and expectations remain pending review.</w:t>
+        <w:t xml:space="preserve">The submission assembly verifies source inclusion, report files, six root installation scripts, runtime-free application files, executable permissions and SHA-256 checksums. Launch checks use extracted folders containing spaces. Recorded software results do not establish diagnostic accuracy in real patients; clinical knowledge and expectations remain pending review.</w:t>
       </w:r>
     </w:p>
     <w:p>
@@ -4735,7 +4746,7 @@
         <w:rPr>
           <w:rFonts w:ascii="Times New Roman" w:cs="Times New Roman" w:eastAsia="Times New Roman" w:hAnsi="Times New Roman"/>
         </w:rPr>
-        <w:t xml:space="preserve">The implementation preserves uncertainty, supports coexisting candidates and returns defined responses for incomplete, conflicting and unsupported inputs. The submission provides source, a platform-specific runnable package for each supported operating system and a user manual. Automated verification passes across the three target platforms, with manual macOS inspection. The human expert is identified and the conducted questionnaire is supplied in Appendix B; clinical review remains pending.</w:t>
+        <w:t xml:space="preserve">The implementation preserves uncertainty, supports coexisting candidates and returns defined responses for incomplete, conflicting and unsupported inputs. The submission provides source, runtime-free application files, six installation scripts and a launch-only user manual. Automated verification passes across the three target platforms, with manual macOS inspection. The human expert is identified and the conducted questionnaire is supplied in Appendix B; clinical review remains pending.</w:t>
       </w:r>
     </w:p>
     <w:p>
@@ -4834,7 +4845,7 @@
         <w:rPr>
           <w:rFonts w:ascii="Times New Roman" w:cs="Times New Roman" w:eastAsia="Times New Roman" w:hAnsi="Times New Roman"/>
         </w:rPr>
-        <w:t xml:space="preserve">[8] Oracle. Java 21 jpackage Packaging Overview. https://docs.oracle.com/en/java/javase/21/jpackage/packaging-overview.html</w:t>
+        <w:t xml:space="preserve">[8] Eclipse Adoptium. Installing Temurin. https://adoptium.net/installation/</w:t>
       </w:r>
     </w:p>
     <w:p>
@@ -4856,7 +4867,7 @@
         <w:rPr>
           <w:rFonts w:ascii="Times New Roman" w:cs="Times New Roman" w:eastAsia="Times New Roman" w:hAnsi="Times New Roman"/>
         </w:rPr>
-        <w:t xml:space="preserve">[10] DentalExplain. Verified cross-platform workflow run, 29 September 2026, source commit 3309824. https://github.com/vishwajayawickrama/dental-expert-system/actions/runs/36566312964</w:t>
+        <w:t xml:space="preserve">[10] DentalExplain. Verified lightweight external-runtime workflow, 29 September 2026, source commit 0f346be. https://github.com/vishwajayawickrama/dental-expert-system/actions/runs/36574386759</w:t>
       </w:r>
     </w:p>
     <w:p>
@@ -4897,7 +4908,7 @@
           <w:b/>
           <w:bCs/>
         </w:rPr>
-        <w:t xml:space="preserve">1.2.0</w:t>
+        <w:t xml:space="preserve">1.3.0</w:t>
       </w:r>
       <w:r>
         <w:rPr>
@@ -4917,7 +4928,7 @@
         <w:rPr>
           <w:rFonts w:ascii="Times New Roman" w:cs="Times New Roman" w:eastAsia="Times New Roman" w:hAnsi="Times New Roman"/>
         </w:rPr>
-        <w:t xml:space="preserve">. Extract the complete submission ZIP before opening the application. Keep the applications folder and all accompanying runtime files together. Java and SWI-Prolog are bundled; no separate installation or compilation is needed.</w:t>
+        <w:t xml:space="preserve">. Extract the complete DentalExplain-submission.zip first. Initial dependency installation needs internet access and administrator permission. It installs Java 21 and SWI-Prolog/JPL 10.0.2 machine-wide; the second script installs DentalExplain for your current user. Keep the extracted folders together until setup completes. Ordinary consultations then work offline.</w:t>
       </w:r>
     </w:p>
     <w:p>
@@ -4939,7 +4950,7 @@
         <w:rPr>
           <w:rFonts w:ascii="Times New Roman" w:cs="Times New Roman" w:eastAsia="Times New Roman" w:hAnsi="Times New Roman"/>
         </w:rPr>
-        <w:t xml:space="preserve">1. Right-click DentalExplain-submission.zip and choose </w:t>
+        <w:t xml:space="preserve">1. Right-click the ZIP and choose </w:t>
       </w:r>
       <w:r>
         <w:rPr>
@@ -4965,7 +4976,7 @@
         <w:rPr>
           <w:rFonts w:ascii="Times New Roman" w:cs="Times New Roman" w:eastAsia="Times New Roman" w:hAnsi="Times New Roman"/>
         </w:rPr>
-        <w:t xml:space="preserve">2. Open the extracted folder and double-click </w:t>
+        <w:t xml:space="preserve">2. Double-click </w:t>
       </w:r>
       <w:r>
         <w:rPr>
@@ -4973,13 +4984,13 @@
           <w:b/>
           <w:bCs/>
         </w:rPr>
-        <w:t xml:space="preserve">Open-Windows.cmd</w:t>
-      </w:r>
-      <w:r>
-        <w:rPr>
-          <w:rFonts w:ascii="Times New Roman" w:cs="Times New Roman" w:eastAsia="Times New Roman" w:hAnsi="Times New Roman"/>
-        </w:rPr>
-        <w:t xml:space="preserve">.</w:t>
+        <w:t xml:space="preserve">Install-Dependencies-Windows.cmd</w:t>
+      </w:r>
+      <w:r>
+        <w:rPr>
+          <w:rFonts w:ascii="Times New Roman" w:cs="Times New Roman" w:eastAsia="Times New Roman" w:hAnsi="Times New Roman"/>
+        </w:rPr>
+        <w:t xml:space="preserve">. Allow the administrator prompt and wait for “Dependencies ready”.</w:t>
       </w:r>
     </w:p>
     <w:p>
@@ -4991,7 +5002,7 @@
         <w:rPr>
           <w:rFonts w:ascii="Times New Roman" w:cs="Times New Roman" w:eastAsia="Times New Roman" w:hAnsi="Times New Roman"/>
         </w:rPr>
-        <w:t xml:space="preserve">3. Alternatively, open </w:t>
+        <w:t xml:space="preserve">3. Double-click </w:t>
       </w:r>
       <w:r>
         <w:rPr>
@@ -4999,23 +5010,13 @@
           <w:b/>
           <w:bCs/>
         </w:rPr>
-        <w:t xml:space="preserve">DentalExplain.exe</w:t>
-      </w:r>
-      <w:r>
-        <w:rPr>
-          <w:rFonts w:ascii="Times New Roman" w:cs="Times New Roman" w:eastAsia="Times New Roman" w:hAnsi="Times New Roman"/>
-        </w:rPr>
-        <w:t xml:space="preserve"> inside applications/windows/DentalExplain.</w:t>
-      </w:r>
-    </w:p>
-    <w:p>
-      <w:pPr>
-        <w:pStyle w:val="Heading2"/>
-        <w:keepNext/>
-        <w:spacing w:after="140" w:before="220"/>
-      </w:pPr>
-      <w:r>
-        <w:t xml:space="preserve">A.2 Apple Silicon macOS</w:t>
+        <w:t xml:space="preserve">Install-Application-Windows.cmd</w:t>
+      </w:r>
+      <w:r>
+        <w:rPr>
+          <w:rFonts w:ascii="Times New Roman" w:cs="Times New Roman" w:eastAsia="Times New Roman" w:hAnsi="Times New Roman"/>
+        </w:rPr>
+        <w:t xml:space="preserve">. The app opens after installation.</w:t>
       </w:r>
     </w:p>
     <w:p>
@@ -5027,19 +5028,7 @@
         <w:rPr>
           <w:rFonts w:ascii="Times New Roman" w:cs="Times New Roman" w:eastAsia="Times New Roman" w:hAnsi="Times New Roman"/>
         </w:rPr>
-        <w:t xml:space="preserve">1. Double-click DentalExplain-submission.zip to extract it.</w:t>
-      </w:r>
-    </w:p>
-    <w:p>
-      <w:pPr>
-        <w:spacing w:after="120" w:line="270"/>
-        <w:ind w:left="200" w:hanging="200"/>
-      </w:pPr>
-      <w:r>
-        <w:rPr>
-          <w:rFonts w:ascii="Times New Roman" w:cs="Times New Roman" w:eastAsia="Times New Roman" w:hAnsi="Times New Roman"/>
-        </w:rPr>
-        <w:t xml:space="preserve">2. Open the extracted folder and double-click </w:t>
+        <w:t xml:space="preserve">4. On later runs, open </w:t>
       </w:r>
       <w:r>
         <w:rPr>
@@ -5047,13 +5036,23 @@
           <w:b/>
           <w:bCs/>
         </w:rPr>
-        <w:t xml:space="preserve">Open-macOS.command</w:t>
-      </w:r>
-      <w:r>
-        <w:rPr>
-          <w:rFonts w:ascii="Times New Roman" w:cs="Times New Roman" w:eastAsia="Times New Roman" w:hAnsi="Times New Roman"/>
-        </w:rPr>
-        <w:t xml:space="preserve">.</w:t>
+        <w:t xml:space="preserve">DentalExplain</w:t>
+      </w:r>
+      <w:r>
+        <w:rPr>
+          <w:rFonts w:ascii="Times New Roman" w:cs="Times New Roman" w:eastAsia="Times New Roman" w:hAnsi="Times New Roman"/>
+        </w:rPr>
+        <w:t xml:space="preserve"> from the desktop or Start menu. The shortcut starts the installed DentalExplain.exe.</w:t>
+      </w:r>
+    </w:p>
+    <w:p>
+      <w:pPr>
+        <w:pStyle w:val="Heading2"/>
+        <w:keepNext/>
+        <w:spacing w:after="140" w:before="220"/>
+      </w:pPr>
+      <w:r>
+        <w:t xml:space="preserve">A.2 Apple Silicon macOS</w:t>
       </w:r>
     </w:p>
     <w:p>
@@ -5065,7 +5064,19 @@
         <w:rPr>
           <w:rFonts w:ascii="Times New Roman" w:cs="Times New Roman" w:eastAsia="Times New Roman" w:hAnsi="Times New Roman"/>
         </w:rPr>
-        <w:t xml:space="preserve">3. Alternatively, open </w:t>
+        <w:t xml:space="preserve">1. Double-click the ZIP to extract it.</w:t>
+      </w:r>
+    </w:p>
+    <w:p>
+      <w:pPr>
+        <w:spacing w:after="120" w:line="270"/>
+        <w:ind w:left="200" w:hanging="200"/>
+      </w:pPr>
+      <w:r>
+        <w:rPr>
+          <w:rFonts w:ascii="Times New Roman" w:cs="Times New Roman" w:eastAsia="Times New Roman" w:hAnsi="Times New Roman"/>
+        </w:rPr>
+        <w:t xml:space="preserve">2. Double-click </w:t>
       </w:r>
       <w:r>
         <w:rPr>
@@ -5073,13 +5084,79 @@
           <w:b/>
           <w:bCs/>
         </w:rPr>
+        <w:t xml:space="preserve">Install-Dependencies-macOS.command</w:t>
+      </w:r>
+      <w:r>
+        <w:rPr>
+          <w:rFonts w:ascii="Times New Roman" w:cs="Times New Roman" w:eastAsia="Times New Roman" w:hAnsi="Times New Roman"/>
+        </w:rPr>
+        <w:t xml:space="preserve">. Enter your administrator password if requested; wait for “Dependencies ready”.</w:t>
+      </w:r>
+    </w:p>
+    <w:p>
+      <w:pPr>
+        <w:spacing w:after="120" w:line="270"/>
+        <w:ind w:left="200" w:hanging="200"/>
+      </w:pPr>
+      <w:r>
+        <w:rPr>
+          <w:rFonts w:ascii="Times New Roman" w:cs="Times New Roman" w:eastAsia="Times New Roman" w:hAnsi="Times New Roman"/>
+        </w:rPr>
+        <w:t xml:space="preserve">3. Double-click </w:t>
+      </w:r>
+      <w:r>
+        <w:rPr>
+          <w:rFonts w:ascii="Times New Roman" w:cs="Times New Roman" w:eastAsia="Times New Roman" w:hAnsi="Times New Roman"/>
+          <w:b/>
+          <w:bCs/>
+        </w:rPr>
+        <w:t xml:space="preserve">Install-Application-macOS.command</w:t>
+      </w:r>
+      <w:r>
+        <w:rPr>
+          <w:rFonts w:ascii="Times New Roman" w:cs="Times New Roman" w:eastAsia="Times New Roman" w:hAnsi="Times New Roman"/>
+        </w:rPr>
+        <w:t xml:space="preserve">. The app opens after installation.</w:t>
+      </w:r>
+    </w:p>
+    <w:p>
+      <w:pPr>
+        <w:spacing w:after="120" w:line="270"/>
+        <w:ind w:left="200" w:hanging="200"/>
+      </w:pPr>
+      <w:r>
+        <w:rPr>
+          <w:rFonts w:ascii="Times New Roman" w:cs="Times New Roman" w:eastAsia="Times New Roman" w:hAnsi="Times New Roman"/>
+        </w:rPr>
+        <w:t xml:space="preserve">4. On later runs, open </w:t>
+      </w:r>
+      <w:r>
+        <w:rPr>
+          <w:rFonts w:ascii="Times New Roman" w:cs="Times New Roman" w:eastAsia="Times New Roman" w:hAnsi="Times New Roman"/>
+          <w:b/>
+          <w:bCs/>
+        </w:rPr>
         <w:t xml:space="preserve">DentalExplain.app</w:t>
       </w:r>
       <w:r>
         <w:rPr>
           <w:rFonts w:ascii="Times New Roman" w:cs="Times New Roman" w:eastAsia="Times New Roman" w:hAnsi="Times New Roman"/>
         </w:rPr>
-        <w:t xml:space="preserve"> inside applications/macos. You may copy the complete app to Applications.</w:t>
+        <w:t xml:space="preserve"> in your home folder’s </w:t>
+      </w:r>
+      <w:r>
+        <w:rPr>
+          <w:rFonts w:ascii="Times New Roman" w:cs="Times New Roman" w:eastAsia="Times New Roman" w:hAnsi="Times New Roman"/>
+          <w:b/>
+          <w:bCs/>
+        </w:rPr>
+        <w:t xml:space="preserve">Applications</w:t>
+      </w:r>
+      <w:r>
+        <w:rPr>
+          <w:rFonts w:ascii="Times New Roman" w:cs="Times New Roman" w:eastAsia="Times New Roman" w:hAnsi="Times New Roman"/>
+        </w:rPr>
+        <w:t xml:space="preserve"> folder.</w:t>
       </w:r>
     </w:p>
     <w:p>
@@ -5101,7 +5178,7 @@
         <w:rPr>
           <w:rFonts w:ascii="Times New Roman" w:cs="Times New Roman" w:eastAsia="Times New Roman" w:hAnsi="Times New Roman"/>
         </w:rPr>
-        <w:t xml:space="preserve">1. Extract DentalExplain-submission.zip and open a terminal in the extracted folder.</w:t>
+        <w:t xml:space="preserve">1. Extract the ZIP and open a terminal in the extracted folder.</w:t>
       </w:r>
     </w:p>
     <w:p>
@@ -5119,13 +5196,63 @@
         <w:rPr>
           <w:rFonts w:ascii="Times New Roman" w:cs="Times New Roman" w:eastAsia="Times New Roman" w:hAnsi="Times New Roman"/>
         </w:rPr>
-        <w:t xml:space="preserve">./Open-Linux.sh</w:t>
-      </w:r>
-      <w:r>
-        <w:rPr>
-          <w:rFonts w:ascii="Times New Roman" w:cs="Times New Roman" w:eastAsia="Times New Roman" w:hAnsi="Times New Roman"/>
-        </w:rPr>
-        <w:t xml:space="preserve">. A graphical desktop is required.</w:t>
+        <w:t xml:space="preserve">bash Install-Dependencies-Linux.sh</w:t>
+      </w:r>
+      <w:r>
+        <w:rPr>
+          <w:rFonts w:ascii="Times New Roman" w:cs="Times New Roman" w:eastAsia="Times New Roman" w:hAnsi="Times New Roman"/>
+        </w:rPr>
+        <w:t xml:space="preserve">. Enter your administrator password if requested. The first run compiles SWI-Prolog 10.0.2 with JPL and can take several minutes.</w:t>
+      </w:r>
+    </w:p>
+    <w:p>
+      <w:pPr>
+        <w:spacing w:after="120" w:line="270"/>
+        <w:ind w:left="200" w:hanging="200"/>
+      </w:pPr>
+      <w:r>
+        <w:rPr>
+          <w:rFonts w:ascii="Times New Roman" w:cs="Times New Roman" w:eastAsia="Times New Roman" w:hAnsi="Times New Roman"/>
+        </w:rPr>
+        <w:t xml:space="preserve">3. Run </w:t>
+      </w:r>
+      <w:r>
+        <w:rPr>
+          <w:rFonts w:ascii="Times New Roman" w:cs="Times New Roman" w:eastAsia="Times New Roman" w:hAnsi="Times New Roman"/>
+        </w:rPr>
+        <w:t xml:space="preserve">bash Install-Application-Linux.sh</w:t>
+      </w:r>
+      <w:r>
+        <w:rPr>
+          <w:rFonts w:ascii="Times New Roman" w:cs="Times New Roman" w:eastAsia="Times New Roman" w:hAnsi="Times New Roman"/>
+        </w:rPr>
+        <w:t xml:space="preserve">. The app opens after installation; a graphical desktop is required.</w:t>
+      </w:r>
+    </w:p>
+    <w:p>
+      <w:pPr>
+        <w:spacing w:after="120" w:line="270"/>
+        <w:ind w:left="200" w:hanging="200"/>
+      </w:pPr>
+      <w:r>
+        <w:rPr>
+          <w:rFonts w:ascii="Times New Roman" w:cs="Times New Roman" w:eastAsia="Times New Roman" w:hAnsi="Times New Roman"/>
+        </w:rPr>
+        <w:t xml:space="preserve">4. On later runs, open </w:t>
+      </w:r>
+      <w:r>
+        <w:rPr>
+          <w:rFonts w:ascii="Times New Roman" w:cs="Times New Roman" w:eastAsia="Times New Roman" w:hAnsi="Times New Roman"/>
+          <w:b/>
+          <w:bCs/>
+        </w:rPr>
+        <w:t xml:space="preserve">DentalExplain</w:t>
+      </w:r>
+      <w:r>
+        <w:rPr>
+          <w:rFonts w:ascii="Times New Roman" w:cs="Times New Roman" w:eastAsia="Times New Roman" w:hAnsi="Times New Roman"/>
+        </w:rPr>
+        <w:t xml:space="preserve"> from the application menu.</w:t>
       </w:r>
     </w:p>
     <w:p>
@@ -5146,31 +5273,19 @@
         <w:rPr>
           <w:rFonts w:ascii="Times New Roman" w:cs="Times New Roman" w:eastAsia="Times New Roman" w:hAnsi="Times New Roman"/>
         </w:rPr>
-        <w:t xml:space="preserve">If a Unix extraction tool removed executable permissions, run </w:t>
-      </w:r>
-      <w:r>
-        <w:rPr>
-          <w:rFonts w:ascii="Times New Roman" w:cs="Times New Roman" w:eastAsia="Times New Roman" w:hAnsi="Times New Roman"/>
-        </w:rPr>
-        <w:t xml:space="preserve">chmod +x Open-macOS.command</w:t>
-      </w:r>
-      <w:r>
-        <w:rPr>
-          <w:rFonts w:ascii="Times New Roman" w:cs="Times New Roman" w:eastAsia="Times New Roman" w:hAnsi="Times New Roman"/>
-        </w:rPr>
-        <w:t xml:space="preserve"> on macOS, or </w:t>
-      </w:r>
-      <w:r>
-        <w:rPr>
-          <w:rFonts w:ascii="Times New Roman" w:cs="Times New Roman" w:eastAsia="Times New Roman" w:hAnsi="Times New Roman"/>
-        </w:rPr>
-        <w:t xml:space="preserve">chmod +x Open-Linux.sh applications/linux/DentalExplain/runtime/java/bin/java</w:t>
-      </w:r>
-      <w:r>
-        <w:rPr>
-          <w:rFonts w:ascii="Times New Roman" w:cs="Times New Roman" w:eastAsia="Times New Roman" w:hAnsi="Times New Roman"/>
-        </w:rPr>
-        <w:t xml:space="preserve"> on Linux. If runtime files are missing, extract the complete ZIP again. Use the package matching your operating system and architecture. Windows code signing and macOS notarization remain pending; follow your computer owner's software policy if the operating system blocks a downloaded application.</w:t>
+        <w:t xml:space="preserve">If dependencies are missing, rerun the dependency script, then the application script. Check your internet connection if downloading fails; a checksum mismatch stops installation, so retry with a fresh official download. Existing unrelated Java/Prolog installations are retained. Use the supported operating system and architecture. For missing extracted files, extract the complete ZIP again. If macOS executable permissions were lost during extraction, run </w:t>
+      </w:r>
+      <w:r>
+        <w:rPr>
+          <w:rFonts w:ascii="Times New Roman" w:cs="Times New Roman" w:eastAsia="Times New Roman" w:hAnsi="Times New Roman"/>
+        </w:rPr>
+        <w:t xml:space="preserve">chmod +x Install-*.command</w:t>
+      </w:r>
+      <w:r>
+        <w:rPr>
+          <w:rFonts w:ascii="Times New Roman" w:cs="Times New Roman" w:eastAsia="Times New Roman" w:hAnsi="Times New Roman"/>
+        </w:rPr>
+        <w:t xml:space="preserve">. Windows signing and macOS notarization remain pending; follow your computer owner’s software policy if downloaded software is blocked.</w:t>
       </w:r>
     </w:p>
     <w:p>

</xml_diff>